<commit_message>
Competitive: say where we win, in a headed section, in both documents
Both documents named where the competitor genuinely wins and left our own
strengths to be inferred from a matrix. For a reader who skims headings, the only
section about winning belonged to them. Corrected: "Where we win" now sits
immediately before it in each document, same shape, so both are visible at a
glance and the honest one still reads as honest rather than as the only one.

Ours leads on deciding the page rather than injecting one promo, then
accountability through the explain record and replay, control in seconds with
parity as a setting, memory beyond the session and across devices, both cold
starts, and measurement and governance. The long version adds the latency point,
that the number includes the network leg and publishes its conditions.

Tail sections renumbered in both, including the header pointer to the
customer-safe language.

Co-Authored-By: Claude Opus 5 (1M context) <noreply@anthropic.com>
</commit_message>
<xml_diff>
--- a/docs/Competitive-Quin-Comparison-v1.0.docx
+++ b/docs/Competitive-Quin-Comparison-v1.0.docx
@@ -237,7 +237,7 @@
                 <w:sz w:val="20"/>
                 <w:szCs w:val="20"/>
               </w:rPr>
-              <w:t xml:space="preserve">Version 1.0</w:t>
+              <w:t xml:space="preserve">Version 1.1</w:t>
             </w:r>
           </w:p>
         </w:tc>
@@ -447,7 +447,7 @@
           <w:sz w:val="21"/>
           <w:szCs w:val="21"/>
         </w:rPr>
-        <w:t xml:space="preserve"> It names a competitor and dissects their published claims, so it is not a customer handout. Section 10 is the part that can be said out loud in front of a customer, without naming anyone.</w:t>
+        <w:t xml:space="preserve"> It names a competitor and dissects their published claims, so it is not a customer handout. Section 11 is the part that can be said out loud in front of a customer, without naming anyone.</w:t>
       </w:r>
     </w:p>
     <w:p>
@@ -6418,7 +6418,228 @@
           <w:sz w:val="30"/>
           <w:szCs w:val="30"/>
         </w:rPr>
-        <w:t xml:space="preserve">8. Where they are genuinely stronger</w:t>
+        <w:t xml:space="preserve">8. Where we win</w:t>
+      </w:r>
+    </w:p>
+    <w:p>
+      <w:pPr>
+        <w:spacing w:after="120" w:line="276"/>
+      </w:pPr>
+      <w:r>
+        <w:rPr>
+          <w:rFonts w:ascii="Calibri" w:cs="Calibri" w:eastAsia="Calibri" w:hAnsi="Calibri"/>
+          <w:color w:val="1A1A1A"/>
+          <w:sz w:val="21"/>
+          <w:szCs w:val="21"/>
+        </w:rPr>
+        <w:t xml:space="preserve">The matrix in section 3 shows this, but it is worth naming so nobody has to infer it.</w:t>
+      </w:r>
+    </w:p>
+    <w:p>
+      <w:pPr>
+        <w:spacing w:after="120" w:line="276"/>
+      </w:pPr>
+      <w:r>
+        <w:rPr>
+          <w:rFonts w:ascii="Calibri" w:cs="Calibri" w:eastAsia="Calibri" w:hAnsi="Calibri"/>
+          <w:b/>
+          <w:bCs/>
+          <w:color w:val="1A1A1A"/>
+          <w:sz w:val="21"/>
+          <w:szCs w:val="21"/>
+        </w:rPr>
+        <w:t xml:space="preserve">The page is ours to decide.</w:t>
+      </w:r>
+      <w:r>
+        <w:rPr>
+          <w:rFonts w:ascii="Calibri" w:cs="Calibri" w:eastAsia="Calibri" w:hAnsi="Calibri"/>
+          <w:color w:val="1A1A1A"/>
+          <w:sz w:val="21"/>
+          <w:szCs w:val="21"/>
+        </w:rPr>
+        <w:t xml:space="preserve"> Content into slots, the order of modules, the sort of a product grid, and the assembly of a whole page with de-duplication and pins, from one engine and one shopper model. Their unit is a single injected action.</w:t>
+      </w:r>
+    </w:p>
+    <w:p>
+      <w:pPr>
+        <w:spacing w:after="120" w:line="276"/>
+      </w:pPr>
+      <w:r>
+        <w:rPr>
+          <w:rFonts w:ascii="Calibri" w:cs="Calibri" w:eastAsia="Calibri" w:hAnsi="Calibri"/>
+          <w:b/>
+          <w:bCs/>
+          <w:color w:val="1A1A1A"/>
+          <w:sz w:val="21"/>
+          <w:szCs w:val="21"/>
+        </w:rPr>
+        <w:t xml:space="preserve">Accountability.</w:t>
+      </w:r>
+      <w:r>
+        <w:rPr>
+          <w:rFonts w:ascii="Calibri" w:cs="Calibri" w:eastAsia="Calibri" w:hAnsi="Calibri"/>
+          <w:color w:val="1A1A1A"/>
+          <w:sz w:val="21"/>
+          <w:szCs w:val="21"/>
+        </w:rPr>
+        <w:t xml:space="preserve"> An explain record on every decision, naming each term and its contribution, and a replay that proves a past decision reproduces from its recorded inputs. No explainability claim appears anywhere on their side.</w:t>
+      </w:r>
+    </w:p>
+    <w:p>
+      <w:pPr>
+        <w:spacing w:after="120" w:line="276"/>
+      </w:pPr>
+      <w:r>
+        <w:rPr>
+          <w:rFonts w:ascii="Calibri" w:cs="Calibri" w:eastAsia="Calibri" w:hAnsi="Calibri"/>
+          <w:b/>
+          <w:bCs/>
+          <w:color w:val="1A1A1A"/>
+          <w:sz w:val="21"/>
+          <w:szCs w:val="21"/>
+        </w:rPr>
+        <w:t xml:space="preserve">Control in seconds, not a retraining cycle.</w:t>
+      </w:r>
+      <w:r>
+        <w:rPr>
+          <w:rFonts w:ascii="Calibri" w:cs="Calibri" w:eastAsia="Calibri" w:hAnsi="Calibri"/>
+          <w:color w:val="1A1A1A"/>
+          <w:sz w:val="21"/>
+          <w:szCs w:val="21"/>
+        </w:rPr>
+        <w:t xml:space="preserve"> Every weight, horizon, threshold, cap and share is versioned configuration, effective with no deployment and rollback-able, with parity available as a setting.</w:t>
+      </w:r>
+    </w:p>
+    <w:p>
+      <w:pPr>
+        <w:spacing w:after="120" w:line="276"/>
+      </w:pPr>
+      <w:r>
+        <w:rPr>
+          <w:rFonts w:ascii="Calibri" w:cs="Calibri" w:eastAsia="Calibri" w:hAnsi="Calibri"/>
+          <w:b/>
+          <w:bCs/>
+          <w:color w:val="1A1A1A"/>
+          <w:sz w:val="21"/>
+          <w:szCs w:val="21"/>
+        </w:rPr>
+        <w:t xml:space="preserve">Memory beyond the session.</w:t>
+      </w:r>
+      <w:r>
+        <w:rPr>
+          <w:rFonts w:ascii="Calibri" w:cs="Calibri" w:eastAsia="Calibri" w:hAnsi="Calibri"/>
+          <w:color w:val="1A1A1A"/>
+          <w:sz w:val="21"/>
+          <w:szCs w:val="21"/>
+        </w:rPr>
+        <w:t xml:space="preserve"> Recognition next week and across devices after sign-in, merged rather than overridden, with durable profile facts in the customer data platform. Their own positioning rules this out.</w:t>
+      </w:r>
+    </w:p>
+    <w:p>
+      <w:pPr>
+        <w:spacing w:after="120" w:line="276"/>
+      </w:pPr>
+      <w:r>
+        <w:rPr>
+          <w:rFonts w:ascii="Calibri" w:cs="Calibri" w:eastAsia="Calibri" w:hAnsi="Calibri"/>
+          <w:b/>
+          <w:bCs/>
+          <w:color w:val="1A1A1A"/>
+          <w:sz w:val="21"/>
+          <w:szCs w:val="21"/>
+        </w:rPr>
+        <w:t xml:space="preserve">Both cold starts.</w:t>
+      </w:r>
+      <w:r>
+        <w:rPr>
+          <w:rFonts w:ascii="Calibri" w:cs="Calibri" w:eastAsia="Calibri" w:hAnsi="Calibri"/>
+          <w:color w:val="1A1A1A"/>
+          <w:sz w:val="21"/>
+          <w:szCs w:val="21"/>
+        </w:rPr>
+        <w:t xml:space="preserve"> A visitor with no history, served from region, channel, visit number and the population prior. An asset with no history, inheriting from similar assets and reporting when it has enough evidence.</w:t>
+      </w:r>
+    </w:p>
+    <w:p>
+      <w:pPr>
+        <w:spacing w:after="120" w:line="276"/>
+      </w:pPr>
+      <w:r>
+        <w:rPr>
+          <w:rFonts w:ascii="Calibri" w:cs="Calibri" w:eastAsia="Calibri" w:hAnsi="Calibri"/>
+          <w:b/>
+          <w:bCs/>
+          <w:color w:val="1A1A1A"/>
+          <w:sz w:val="21"/>
+          <w:szCs w:val="21"/>
+        </w:rPr>
+        <w:t xml:space="preserve">Measurement and governance.</w:t>
+      </w:r>
+      <w:r>
+        <w:rPr>
+          <w:rFonts w:ascii="Calibri" w:cs="Calibri" w:eastAsia="Calibri" w:hAnsi="Calibri"/>
+          <w:color w:val="1A1A1A"/>
+          <w:sz w:val="21"/>
+          <w:szCs w:val="21"/>
+        </w:rPr>
+        <w:t xml:space="preserve"> A holdout arm on every decision, per-item evidence per context, decision and outcome export, scheduled warehouse delivery, consent that writes nothing on refusal, erasure with a receipt, and brand isolation.</w:t>
+      </w:r>
+    </w:p>
+    <w:p>
+      <w:pPr>
+        <w:spacing w:after="120" w:line="276"/>
+      </w:pPr>
+      <w:r>
+        <w:rPr>
+          <w:rFonts w:ascii="Calibri" w:cs="Calibri" w:eastAsia="Calibri" w:hAnsi="Calibri"/>
+          <w:b/>
+          <w:bCs/>
+          <w:color w:val="1A1A1A"/>
+          <w:sz w:val="21"/>
+          <w:szCs w:val="21"/>
+        </w:rPr>
+        <w:t xml:space="preserve">Latency you can defend in front of an auditor.</w:t>
+      </w:r>
+      <w:r>
+        <w:rPr>
+          <w:rFonts w:ascii="Calibri" w:cs="Calibri" w:eastAsia="Calibri" w:hAnsi="Calibri"/>
+          <w:color w:val="1A1A1A"/>
+          <w:sz w:val="21"/>
+          <w:szCs w:val="21"/>
+        </w:rPr>
+        <w:t xml:space="preserve"> Decided at the point of presence nearest the shopper, with the network leg included and the conditions published beside the number.</w:t>
+      </w:r>
+    </w:p>
+    <w:p>
+      <w:pPr>
+        <w:pBdr>
+          <w:bottom w:val="single" w:color="C9D1DC" w:sz="6" w:space="1"/>
+        </w:pBdr>
+        <w:spacing w:after="160" w:before="80"/>
+      </w:pPr>
+      <w:r>
+        <w:t xml:space="preserve"/>
+      </w:r>
+    </w:p>
+    <w:p>
+      <w:pPr>
+        <w:pStyle w:val="Heading1"/>
+        <w:pageBreakBefore/>
+        <w:pBdr>
+          <w:bottom w:val="single" w:color="0B5CAD" w:sz="12" w:space="6"/>
+        </w:pBdr>
+        <w:spacing w:after="160" w:before="0"/>
+      </w:pPr>
+      <w:r>
+        <w:rPr>
+          <w:rFonts w:ascii="Calibri" w:cs="Calibri" w:eastAsia="Calibri" w:hAnsi="Calibri"/>
+          <w:b/>
+          <w:bCs/>
+          <w:color w:val="11142A"/>
+          <w:sz w:val="30"/>
+          <w:szCs w:val="30"/>
+        </w:rPr>
+        <w:t xml:space="preserve">9. Where they are genuinely stronger</w:t>
       </w:r>
     </w:p>
     <w:p>
@@ -6584,7 +6805,7 @@
           <w:sz w:val="30"/>
           <w:szCs w:val="30"/>
         </w:rPr>
-        <w:t xml:space="preserve">9. Three questions to ask them</w:t>
+        <w:t xml:space="preserve">10. Three questions to ask them</w:t>
       </w:r>
     </w:p>
     <w:p>
@@ -6678,7 +6899,7 @@
           <w:sz w:val="30"/>
           <w:szCs w:val="30"/>
         </w:rPr>
-        <w:t xml:space="preserve">10. How to say this in front of a customer, without naming anyone</w:t>
+        <w:t xml:space="preserve">11. How to say this in front of a customer, without naming anyone</w:t>
       </w:r>
     </w:p>
     <w:p>
@@ -6877,7 +7098,7 @@
         <w:sz w:val="17"/>
         <w:szCs w:val="17"/>
       </w:rPr>
-      <w:t xml:space="preserve">Optimizely product management  ·  Version 1.0</w:t>
+      <w:t xml:space="preserve">Optimizely product management  ·  Version 1.1</w:t>
     </w:r>
     <w:r>
       <w:rPr>

</xml_diff>